<commit_message>
Replace help notes with session prompt history
Rename Help-docs/claude.txt to claude-prompt-history.txt and replace its
contents with a summary of the prompts used to build the validator.
Also update Process.docx.

Co-Authored-By: Claude Opus 5.5 <noreply@anthropic.com>
</commit_message>
<xml_diff>
--- a/Help-docs/Process.docx
+++ b/Help-docs/Process.docx
@@ -162,21 +162,7 @@
           <w:color w:val="4C94D8" w:themeColor="text2" w:themeTint="80"/>
           <w:lang w:val="pt-BR"/>
         </w:rPr>
-        <w:t xml:space="preserve"> </w:t>
-      </w:r>
-      <w:r>
-        <w:rPr>
-          <w:color w:val="4C94D8" w:themeColor="text2" w:themeTint="80"/>
-          <w:lang w:val="pt-BR"/>
-        </w:rPr>
-        <w:t>venv-manifest-validator</w:t>
-      </w:r>
-      <w:r>
-        <w:rPr>
-          <w:color w:val="4C94D8" w:themeColor="text2" w:themeTint="80"/>
-          <w:lang w:val="pt-BR"/>
-        </w:rPr>
-        <w:t>`</w:t>
+        <w:t xml:space="preserve"> venv-manifest-validator`</w:t>
       </w:r>
       <w:r>
         <w:rPr>
@@ -425,6 +411,15 @@
       <w:r>
         <w:t>Ran the installer and setup</w:t>
       </w:r>
+      <w:r>
+        <w:t xml:space="preserve">. </w:t>
+      </w:r>
+      <w:r>
+        <w:rPr>
+          <w:highlight w:val="yellow"/>
+        </w:rPr>
+        <w:t>Opted to use the name ‘main’ as is the current trend for the main branch. Opted to ‘merge’ when git pull is called</w:t>
+      </w:r>
     </w:p>
     <w:p>
       <w:pPr>
@@ -653,10 +648,7 @@
         <w:t>echo "venv</w:t>
       </w:r>
       <w:r>
-        <w:t xml:space="preserve"> </w:t>
-      </w:r>
-      <w:r>
-        <w:t>-manifest-validator</w:t>
+        <w:t xml:space="preserve"> -manifest-validator</w:t>
       </w:r>
       <w:r>
         <w:t>/" &gt;&gt; .gitignore</w:t>
@@ -906,6 +898,7 @@
         <w:rPr>
           <w:noProof/>
         </w:rPr>
+        <w:lastRenderedPageBreak/>
         <mc:AlternateContent>
           <mc:Choice Requires="wps">
             <w:drawing>
@@ -1196,6 +1189,7 @@
         </w:rPr>
       </w:pPr>
       <w:r>
+        <w:lastRenderedPageBreak/>
         <w:t xml:space="preserve">See the </w:t>
       </w:r>
       <w:r>
@@ -1532,13 +1526,7 @@
         <w:rPr>
           <w:color w:val="45B0E1" w:themeColor="accent1" w:themeTint="99"/>
         </w:rPr>
-        <w:t>`Path`</w:t>
-      </w:r>
-      <w:r>
-        <w:rPr>
-          <w:color w:val="45B0E1" w:themeColor="accent1" w:themeTint="99"/>
-        </w:rPr>
-        <w:t xml:space="preserve"> </w:t>
+        <w:t xml:space="preserve">`Path` </w:t>
       </w:r>
       <w:r>
         <w:t xml:space="preserve">to highlight it and click </w:t>
@@ -1799,14 +1787,7 @@
           <w:b/>
           <w:bCs/>
         </w:rPr>
-        <w:t>Start Claude Code inside your project directory by running</w:t>
-      </w:r>
-      <w:r>
-        <w:rPr>
-          <w:b/>
-          <w:bCs/>
-        </w:rPr>
-        <w:t xml:space="preserve"> below command in VS code powershell</w:t>
+        <w:t>Start Claude Code inside your project directory by running below command in VS code powershell</w:t>
       </w:r>
     </w:p>
     <w:p>
@@ -1839,6 +1820,7 @@
         <w:t>`</w:t>
       </w:r>
     </w:p>
+    <w:p/>
     <w:p>
       <w:pPr>
         <w:ind w:left="720"/>
@@ -2281,44 +2263,526 @@
     </w:p>
     <w:p>
       <w:pPr>
-        <w:pStyle w:val="ListParagraph"/>
+        <w:pStyle w:val="Heading3"/>
         <w:numPr>
           <w:ilvl w:val="0"/>
           <w:numId w:val="6"/>
         </w:numPr>
         <w:rPr>
+          <w:b/>
+          <w:bCs/>
+        </w:rPr>
+      </w:pPr>
+      <w:r>
+        <w:rPr>
+          <w:b/>
+          <w:bCs/>
+        </w:rPr>
+        <w:lastRenderedPageBreak/>
+        <w:t>Claude login</w:t>
+      </w:r>
+    </w:p>
+    <w:p>
+      <w:pPr>
+        <w:ind w:left="720"/>
+      </w:pPr>
+      <w:r>
+        <w:t>Claude asks for a login code in VS code terminal and gives a URL</w:t>
+      </w:r>
+    </w:p>
+    <w:p>
+      <w:pPr>
+        <w:ind w:left="720"/>
+      </w:pPr>
+      <w:r>
+        <w:t>Copy the URL provided to any  browser</w:t>
+      </w:r>
+    </w:p>
+    <w:p>
+      <w:pPr>
+        <w:ind w:left="720"/>
+        <w:rPr>
+          <w:b/>
+          <w:bCs/>
+        </w:rPr>
+      </w:pPr>
+      <w:r>
+        <w:t xml:space="preserve">It will ask to link ckaude code to claude chat and give 2 options: </w:t>
+      </w:r>
+      <w:r>
+        <w:rPr>
+          <w:b/>
+          <w:bCs/>
+        </w:rPr>
+        <w:t>accept / decline</w:t>
+      </w:r>
+    </w:p>
+    <w:p>
+      <w:pPr>
+        <w:ind w:left="720"/>
+        <w:rPr>
+          <w:b/>
+          <w:bCs/>
+        </w:rPr>
+      </w:pPr>
+      <w:r>
+        <w:rPr>
+          <w:b/>
+          <w:bCs/>
+        </w:rPr>
+        <w:t>Select accept, otherwise it will not expose the code you need to login to claude in VS code</w:t>
+      </w:r>
+    </w:p>
+    <w:p>
+      <w:pPr>
+        <w:ind w:left="720"/>
+        <w:rPr>
+          <w:b/>
+          <w:bCs/>
+        </w:rPr>
+      </w:pPr>
+      <w:r>
+        <w:rPr>
+          <w:b/>
+          <w:bCs/>
+        </w:rPr>
+        <w:t xml:space="preserve">Once logged in see below </w:t>
+      </w:r>
+    </w:p>
+    <w:p>
+      <w:pPr>
+        <w:ind w:left="720"/>
+        <w:rPr>
+          <w:b/>
+          <w:bCs/>
+        </w:rPr>
+      </w:pPr>
+      <w:r>
+        <w:rPr>
+          <w:b/>
+          <w:bCs/>
+          <w:noProof/>
+        </w:rPr>
+        <mc:AlternateContent>
+          <mc:Choice Requires="wps">
+            <w:drawing>
+              <wp:anchor distT="45720" distB="45720" distL="114300" distR="114300" simplePos="0" relativeHeight="251663360" behindDoc="0" locked="0" layoutInCell="1" allowOverlap="1" wp14:anchorId="34CCD280" wp14:editId="30B438B7">
+                <wp:simplePos x="0" y="0"/>
+                <wp:positionH relativeFrom="column">
+                  <wp:align>center</wp:align>
+                </wp:positionH>
+                <wp:positionV relativeFrom="paragraph">
+                  <wp:posOffset>182880</wp:posOffset>
+                </wp:positionV>
+                <wp:extent cx="2360930" cy="1404620"/>
+                <wp:effectExtent l="0" t="0" r="22860" b="11430"/>
+                <wp:wrapSquare wrapText="bothSides"/>
+                <wp:docPr id="710740908" name="Text Box 2"/>
+                <wp:cNvGraphicFramePr>
+                  <a:graphicFrameLocks xmlns:a="http://schemas.openxmlformats.org/drawingml/2006/main"/>
+                </wp:cNvGraphicFramePr>
+                <a:graphic xmlns:a="http://schemas.openxmlformats.org/drawingml/2006/main">
+                  <a:graphicData uri="http://schemas.microsoft.com/office/word/2010/wordprocessingShape">
+                    <wps:wsp>
+                      <wps:cNvSpPr txBox="1">
+                        <a:spLocks noChangeArrowheads="1"/>
+                      </wps:cNvSpPr>
+                      <wps:spPr bwMode="auto">
+                        <a:xfrm>
+                          <a:off x="0" y="0"/>
+                          <a:ext cx="2360930" cy="1404620"/>
+                        </a:xfrm>
+                        <a:prstGeom prst="rect">
+                          <a:avLst/>
+                        </a:prstGeom>
+                        <a:solidFill>
+                          <a:srgbClr val="FFFFFF"/>
+                        </a:solidFill>
+                        <a:ln w="9525">
+                          <a:solidFill>
+                            <a:srgbClr val="000000"/>
+                          </a:solidFill>
+                          <a:miter lim="800000"/>
+                          <a:headEnd/>
+                          <a:tailEnd/>
+                        </a:ln>
+                      </wps:spPr>
+                      <wps:txbx>
+                        <w:txbxContent>
+                          <w:p>
+                            <w:r>
+                              <w:rPr>
+                                <w:color w:val="EE0000"/>
+                              </w:rPr>
+                              <w:t xml:space="preserve">Welcome to Claude Code </w:t>
+                            </w:r>
+                            <w:r>
+                              <w:t>v2.1.302</w:t>
+                            </w:r>
+                          </w:p>
+                          <w:p/>
+                          <w:p>
+                            <w:r>
+                              <w:t xml:space="preserve"> Logged in as anishceapen@gmail.com</w:t>
+                            </w:r>
+                          </w:p>
+                          <w:p>
+                            <w:pPr>
+                              <w:rPr>
+                                <w:color w:val="00B050"/>
+                              </w:rPr>
+                            </w:pPr>
+                            <w:r>
+                              <w:rPr>
+                                <w:color w:val="00B050"/>
+                              </w:rPr>
+                              <w:t xml:space="preserve"> Login successful. Press Enter to continue…</w:t>
+                            </w:r>
+                          </w:p>
+                        </w:txbxContent>
+                      </wps:txbx>
+                      <wps:bodyPr rot="0" vert="horz" wrap="square" lIns="91440" tIns="45720" rIns="91440" bIns="45720" anchor="t" anchorCtr="0">
+                        <a:spAutoFit/>
+                      </wps:bodyPr>
+                    </wps:wsp>
+                  </a:graphicData>
+                </a:graphic>
+                <wp14:sizeRelH relativeFrom="margin">
+                  <wp14:pctWidth>40000</wp14:pctWidth>
+                </wp14:sizeRelH>
+                <wp14:sizeRelV relativeFrom="margin">
+                  <wp14:pctHeight>20000</wp14:pctHeight>
+                </wp14:sizeRelV>
+              </wp:anchor>
+            </w:drawing>
+          </mc:Choice>
+          <mc:Fallback>
+            <w:pict>
+              <v:shape w14:anchorId="34CCD280" id="_x0000_s1028" type="#_x0000_t202" style="position:absolute;left:0;text-align:left;margin-left:0;margin-top:14.4pt;width:185.9pt;height:110.6pt;z-index:251663360;visibility:visible;mso-wrap-style:square;mso-width-percent:400;mso-height-percent:200;mso-wrap-distance-left:9pt;mso-wrap-distance-top:3.6pt;mso-wrap-distance-right:9pt;mso-wrap-distance-bottom:3.6pt;mso-position-horizontal:center;mso-position-horizontal-relative:text;mso-position-vertical:absolute;mso-position-vertical-relative:text;mso-width-percent:400;mso-height-percent:200;mso-width-relative:margin;mso-height-relative:margin;v-text-anchor:top" o:gfxdata="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">
+                <v:textbox style="mso-fit-shape-to-text:t">
+                  <w:txbxContent>
+                    <w:p>
+                      <w:r>
+                        <w:rPr>
+                          <w:color w:val="EE0000"/>
+                        </w:rPr>
+                        <w:t xml:space="preserve">Welcome to Claude Code </w:t>
+                      </w:r>
+                      <w:r>
+                        <w:t>v2.1.302</w:t>
+                      </w:r>
+                    </w:p>
+                    <w:p/>
+                    <w:p>
+                      <w:r>
+                        <w:t xml:space="preserve"> Logged in as anishceapen@gmail.com</w:t>
+                      </w:r>
+                    </w:p>
+                    <w:p>
+                      <w:pPr>
+                        <w:rPr>
+                          <w:color w:val="00B050"/>
+                        </w:rPr>
+                      </w:pPr>
+                      <w:r>
+                        <w:rPr>
+                          <w:color w:val="00B050"/>
+                        </w:rPr>
+                        <w:t xml:space="preserve"> Login successful. Press Enter to continue…</w:t>
+                      </w:r>
+                    </w:p>
+                  </w:txbxContent>
+                </v:textbox>
+                <w10:wrap type="square"/>
+              </v:shape>
+            </w:pict>
+          </mc:Fallback>
+        </mc:AlternateContent>
+      </w:r>
+    </w:p>
+    <w:p/>
+    <w:p>
+      <w:pPr>
+        <w:ind w:left="2160"/>
+      </w:pPr>
+    </w:p>
+    <w:p>
+      <w:pPr>
+        <w:ind w:left="2160"/>
+      </w:pPr>
+    </w:p>
+    <w:p>
+      <w:pPr>
+        <w:pStyle w:val="ListParagraph"/>
+        <w:ind w:left="2160"/>
+      </w:pPr>
+    </w:p>
+    <w:p/>
+    <w:p>
+      <w:pPr>
+        <w:pStyle w:val="ListParagraph"/>
+        <w:ind w:left="1440"/>
+      </w:pPr>
+    </w:p>
+    <w:p/>
+    <w:p>
+      <w:pPr>
+        <w:pStyle w:val="Heading3"/>
+        <w:ind w:left="720"/>
+      </w:pPr>
+    </w:p>
+    <w:p>
+      <w:pPr>
+        <w:pStyle w:val="Heading3"/>
+        <w:numPr>
+          <w:ilvl w:val="0"/>
+          <w:numId w:val="6"/>
+        </w:numPr>
+      </w:pPr>
+      <w:r>
+        <w:rPr>
+          <w:b/>
+          <w:bCs/>
+        </w:rPr>
+        <w:t xml:space="preserve">Read the </w:t>
+      </w:r>
+      <w:r>
+        <w:rPr>
+          <w:i/>
+          <w:iCs/>
+        </w:rPr>
+        <w:t>Help-docs/claude-prompt-history.txt</w:t>
+      </w:r>
+      <w:r>
+        <w:rPr>
+          <w:i/>
+          <w:iCs/>
+        </w:rPr>
+        <w:t xml:space="preserve"> </w:t>
+      </w:r>
+      <w:r>
+        <w:t>for the prompts and command used</w:t>
+      </w:r>
+      <w:r>
+        <w:t>.</w:t>
+      </w:r>
+      <w:r>
+        <w:t xml:space="preserve"> Below is a brief summary:</w:t>
+      </w:r>
+    </w:p>
+    <w:p>
+      <w:pPr>
+        <w:pStyle w:val="ListParagraph"/>
+        <w:numPr>
+          <w:ilvl w:val="1"/>
+          <w:numId w:val="6"/>
+        </w:numPr>
+      </w:pPr>
+      <w:r>
+        <w:t>All work happened in the scope of the working folder,</w:t>
+      </w:r>
+      <w:r>
+        <w:t xml:space="preserve"> `</w:t>
+      </w:r>
+      <w:r>
+        <w:rPr>
+          <w:b/>
+          <w:bCs/>
+        </w:rPr>
+        <w:t>claude-video-manifest-validator</w:t>
+      </w:r>
+      <w:r>
+        <w:t>`</w:t>
+      </w:r>
+    </w:p>
+    <w:p>
+      <w:pPr>
+        <w:pStyle w:val="ListParagraph"/>
+        <w:numPr>
+          <w:ilvl w:val="1"/>
+          <w:numId w:val="6"/>
+        </w:numPr>
+      </w:pPr>
+      <w:r>
+        <w:t>A virtual environment has been created inside this dir with auto pep8 installed using claude</w:t>
+      </w:r>
+    </w:p>
+    <w:p>
+      <w:pPr>
+        <w:pStyle w:val="ListParagraph"/>
+        <w:numPr>
+          <w:ilvl w:val="1"/>
+          <w:numId w:val="6"/>
+        </w:numPr>
+      </w:pPr>
+      <w:r>
+        <w:t>Created a basic CLAUDE.md file.</w:t>
+      </w:r>
+    </w:p>
+    <w:p>
+      <w:pPr>
+        <w:pStyle w:val="ListParagraph"/>
+        <w:numPr>
+          <w:ilvl w:val="1"/>
+          <w:numId w:val="6"/>
+        </w:numPr>
+      </w:pPr>
+      <w:r>
+        <w:t>Created a post tool use hook with claude to ensure all python files use the auto pep 8 formatting.</w:t>
+      </w:r>
+    </w:p>
+    <w:p>
+      <w:pPr>
+        <w:pStyle w:val="ListParagraph"/>
+        <w:numPr>
+          <w:ilvl w:val="1"/>
+          <w:numId w:val="6"/>
+        </w:numPr>
+      </w:pPr>
+      <w:r>
+        <w:t>Created a settings.json with claude to run the hook on WRITE/EDITS of python code files.</w:t>
+      </w:r>
+    </w:p>
+    <w:p>
+      <w:pPr>
+        <w:pStyle w:val="ListParagraph"/>
+        <w:numPr>
+          <w:ilvl w:val="1"/>
+          <w:numId w:val="6"/>
+        </w:numPr>
+      </w:pPr>
+      <w:r>
+        <w:t>Created the validator script with claude and added edits after reviews</w:t>
+      </w:r>
+    </w:p>
+    <w:p>
+      <w:pPr>
+        <w:pStyle w:val="ListParagraph"/>
+        <w:numPr>
+          <w:ilvl w:val="1"/>
+          <w:numId w:val="6"/>
+        </w:numPr>
+      </w:pPr>
+      <w:r>
+        <w:t>Created tests and made claude run the tests to find issues. Added tests to a ‘test’ folder</w:t>
+      </w:r>
+    </w:p>
+    <w:p>
+      <w:pPr>
+        <w:pStyle w:val="ListParagraph"/>
+        <w:numPr>
+          <w:ilvl w:val="1"/>
+          <w:numId w:val="6"/>
+        </w:numPr>
+      </w:pPr>
+      <w:r>
+        <w:lastRenderedPageBreak/>
+        <w:t xml:space="preserve">Manually created a new repository </w:t>
+      </w:r>
+      <w:r>
+        <w:t xml:space="preserve"> with the same name as working </w:t>
+      </w:r>
+      <w:r>
+        <w:t>folder (</w:t>
+      </w:r>
+      <w:r>
+        <w:t xml:space="preserve">this is important to match local to remote) </w:t>
+      </w:r>
+      <w:r>
+        <w:t xml:space="preserve">in  </w:t>
+      </w:r>
+      <w:r>
+        <w:t>GitHub from browser. Used defaults for selections and made sure not to select any of the options like create branch etc because I plan to do it locally from command prompt.</w:t>
+      </w:r>
+    </w:p>
+    <w:p>
+      <w:pPr>
+        <w:pStyle w:val="ListParagraph"/>
+        <w:numPr>
+          <w:ilvl w:val="1"/>
+          <w:numId w:val="6"/>
+        </w:numPr>
+      </w:pPr>
+      <w:r>
+        <w:t>Ran the following commands to create</w:t>
+      </w:r>
+      <w:r>
+        <w:t xml:space="preserve"> and commit </w:t>
+      </w:r>
+      <w:r>
+        <w:t xml:space="preserve">to </w:t>
+      </w:r>
+      <w:r>
+        <w:t>GitHub:</w:t>
+      </w:r>
+    </w:p>
+    <w:p>
+      <w:pPr>
+        <w:pStyle w:val="ListParagraph"/>
+        <w:numPr>
+          <w:ilvl w:val="2"/>
+          <w:numId w:val="6"/>
+        </w:numPr>
+        <w:rPr>
           <w:color w:val="4C94D8" w:themeColor="text2" w:themeTint="80"/>
         </w:rPr>
       </w:pPr>
-    </w:p>
-    <w:p>
-      <w:pPr>
-        <w:ind w:left="2160"/>
-      </w:pPr>
-    </w:p>
-    <w:p>
-      <w:pPr>
-        <w:ind w:left="2160"/>
-      </w:pPr>
-    </w:p>
-    <w:p>
-      <w:pPr>
-        <w:pStyle w:val="ListParagraph"/>
-        <w:ind w:left="2160"/>
-      </w:pPr>
-    </w:p>
-    <w:p/>
-    <w:p>
-      <w:pPr>
-        <w:pStyle w:val="ListParagraph"/>
-        <w:ind w:left="1440"/>
-      </w:pPr>
-    </w:p>
-    <w:p/>
+      <w:r>
+        <w:rPr>
+          <w:color w:val="4C94D8" w:themeColor="text2" w:themeTint="80"/>
+        </w:rPr>
+        <w:t xml:space="preserve">git remote add origin </w:t>
+      </w:r>
+      <w:hyperlink r:id="rId10" w:history="1">
+        <w:r>
+          <w:rPr>
+            <w:rStyle w:val="Hyperlink"/>
+            <w:color w:val="4C94D8" w:themeColor="text2" w:themeTint="80"/>
+          </w:rPr>
+          <w:t>https://github.com/Meemathomas/claude-video-manifest-validator.git</w:t>
+        </w:r>
+      </w:hyperlink>
+    </w:p>
+    <w:p>
+      <w:pPr>
+        <w:pStyle w:val="ListParagraph"/>
+        <w:numPr>
+          <w:ilvl w:val="2"/>
+          <w:numId w:val="6"/>
+        </w:numPr>
+        <w:rPr>
+          <w:color w:val="4C94D8" w:themeColor="text2" w:themeTint="80"/>
+        </w:rPr>
+      </w:pPr>
+      <w:r>
+        <w:rPr>
+          <w:color w:val="4C94D8" w:themeColor="text2" w:themeTint="80"/>
+        </w:rPr>
+        <w:t>git push -u origin main</w:t>
+      </w:r>
+    </w:p>
+    <w:p>
+      <w:pPr>
+        <w:pStyle w:val="ListParagraph"/>
+        <w:numPr>
+          <w:ilvl w:val="1"/>
+          <w:numId w:val="6"/>
+        </w:numPr>
+      </w:pPr>
+      <w:r>
+        <w:t>Ran the validator code locally to see the generated result with sample file added to the director</w:t>
+      </w:r>
+      <w:r>
+        <w:t>y</w:t>
+      </w:r>
+    </w:p>
     <w:p>
       <w:pPr>
         <w:ind w:left="720"/>
       </w:pPr>
+      <w:r>
+        <w:t xml:space="preserve"> </w:t>
+      </w:r>
     </w:p>
     <w:p/>
     <w:sectPr>
@@ -2778,16 +3242,17 @@
     </w:lvl>
   </w:abstractNum>
   <w:abstractNum w:abstractNumId="4" w15:restartNumberingAfterBreak="0">
-    <w:nsid w:val="39D568D4"/>
-    <w:multiLevelType w:val="hybridMultilevel"/>
-    <w:tmpl w:val="B9D6ED68"/>
-    <w:lvl w:ilvl="0" w:tplc="2BDC1E3E">
-      <w:start w:val="1"/>
-      <w:numFmt w:val="lowerLetter"/>
+    <w:nsid w:val="34E85F29"/>
+    <w:multiLevelType w:val="multilevel"/>
+    <w:tmpl w:val="601EF8B0"/>
+    <w:styleLink w:val="CurrentList1"/>
+    <w:lvl w:ilvl="0">
+      <w:start w:val="1"/>
+      <w:numFmt w:val="decimal"/>
       <w:lvlText w:val="%1."/>
       <w:lvlJc w:val="left"/>
       <w:pPr>
-        <w:ind w:left="4140" w:hanging="360"/>
+        <w:ind w:left="720" w:hanging="360"/>
       </w:pPr>
       <w:rPr>
         <w:b w:val="0"/>
@@ -2795,90 +3260,96 @@
         <w:color w:val="auto"/>
       </w:rPr>
     </w:lvl>
-    <w:lvl w:ilvl="1" w:tplc="04090019" w:tentative="1">
+    <w:lvl w:ilvl="1">
       <w:start w:val="1"/>
       <w:numFmt w:val="lowerLetter"/>
       <w:lvlText w:val="%2."/>
       <w:lvlJc w:val="left"/>
       <w:pPr>
-        <w:ind w:left="4140" w:hanging="360"/>
-      </w:pPr>
-    </w:lvl>
-    <w:lvl w:ilvl="2" w:tplc="0409001B">
+        <w:ind w:left="1440" w:hanging="360"/>
+      </w:pPr>
+      <w:rPr>
+        <w:color w:val="auto"/>
+      </w:rPr>
+    </w:lvl>
+    <w:lvl w:ilvl="2">
       <w:start w:val="1"/>
       <w:numFmt w:val="lowerRoman"/>
       <w:lvlText w:val="%3."/>
       <w:lvlJc w:val="right"/>
       <w:pPr>
-        <w:ind w:left="4860" w:hanging="180"/>
-      </w:pPr>
-    </w:lvl>
-    <w:lvl w:ilvl="3" w:tplc="0409000F" w:tentative="1">
+        <w:ind w:left="2160" w:hanging="180"/>
+      </w:pPr>
+      <w:rPr>
+        <w:color w:val="auto"/>
+      </w:rPr>
+    </w:lvl>
+    <w:lvl w:ilvl="3">
       <w:start w:val="1"/>
       <w:numFmt w:val="decimal"/>
       <w:lvlText w:val="%4."/>
       <w:lvlJc w:val="left"/>
       <w:pPr>
-        <w:ind w:left="5580" w:hanging="360"/>
-      </w:pPr>
-    </w:lvl>
-    <w:lvl w:ilvl="4" w:tplc="04090019" w:tentative="1">
+        <w:ind w:left="2880" w:hanging="360"/>
+      </w:pPr>
+    </w:lvl>
+    <w:lvl w:ilvl="4">
       <w:start w:val="1"/>
       <w:numFmt w:val="lowerLetter"/>
       <w:lvlText w:val="%5."/>
       <w:lvlJc w:val="left"/>
       <w:pPr>
-        <w:ind w:left="6300" w:hanging="360"/>
-      </w:pPr>
-    </w:lvl>
-    <w:lvl w:ilvl="5" w:tplc="0409001B" w:tentative="1">
+        <w:ind w:left="3600" w:hanging="360"/>
+      </w:pPr>
+    </w:lvl>
+    <w:lvl w:ilvl="5">
       <w:start w:val="1"/>
       <w:numFmt w:val="lowerRoman"/>
       <w:lvlText w:val="%6."/>
       <w:lvlJc w:val="right"/>
       <w:pPr>
-        <w:ind w:left="7020" w:hanging="180"/>
-      </w:pPr>
-    </w:lvl>
-    <w:lvl w:ilvl="6" w:tplc="0409000F" w:tentative="1">
+        <w:ind w:left="4320" w:hanging="180"/>
+      </w:pPr>
+    </w:lvl>
+    <w:lvl w:ilvl="6">
       <w:start w:val="1"/>
       <w:numFmt w:val="decimal"/>
       <w:lvlText w:val="%7."/>
       <w:lvlJc w:val="left"/>
       <w:pPr>
-        <w:ind w:left="7740" w:hanging="360"/>
-      </w:pPr>
-    </w:lvl>
-    <w:lvl w:ilvl="7" w:tplc="04090019" w:tentative="1">
+        <w:ind w:left="5040" w:hanging="360"/>
+      </w:pPr>
+    </w:lvl>
+    <w:lvl w:ilvl="7">
       <w:start w:val="1"/>
       <w:numFmt w:val="lowerLetter"/>
       <w:lvlText w:val="%8."/>
       <w:lvlJc w:val="left"/>
       <w:pPr>
-        <w:ind w:left="8460" w:hanging="360"/>
-      </w:pPr>
-    </w:lvl>
-    <w:lvl w:ilvl="8" w:tplc="0409001B" w:tentative="1">
+        <w:ind w:left="5760" w:hanging="360"/>
+      </w:pPr>
+    </w:lvl>
+    <w:lvl w:ilvl="8">
       <w:start w:val="1"/>
       <w:numFmt w:val="lowerRoman"/>
       <w:lvlText w:val="%9."/>
       <w:lvlJc w:val="right"/>
       <w:pPr>
-        <w:ind w:left="9180" w:hanging="180"/>
+        <w:ind w:left="6480" w:hanging="180"/>
       </w:pPr>
     </w:lvl>
   </w:abstractNum>
   <w:abstractNum w:abstractNumId="5" w15:restartNumberingAfterBreak="0">
-    <w:nsid w:val="41EE0BC1"/>
+    <w:nsid w:val="39D568D4"/>
     <w:multiLevelType w:val="hybridMultilevel"/>
-    <w:tmpl w:val="62AA826E"/>
-    <w:lvl w:ilvl="0" w:tplc="7EA03332">
-      <w:start w:val="1"/>
-      <w:numFmt w:val="decimal"/>
+    <w:tmpl w:val="B9D6ED68"/>
+    <w:lvl w:ilvl="0" w:tplc="2BDC1E3E">
+      <w:start w:val="1"/>
+      <w:numFmt w:val="lowerLetter"/>
       <w:lvlText w:val="%1."/>
       <w:lvlJc w:val="left"/>
       <w:pPr>
-        <w:ind w:left="720" w:hanging="360"/>
+        <w:ind w:left="4140" w:hanging="360"/>
       </w:pPr>
       <w:rPr>
         <w:b w:val="0"/>
@@ -2886,6 +3357,97 @@
         <w:color w:val="auto"/>
       </w:rPr>
     </w:lvl>
+    <w:lvl w:ilvl="1" w:tplc="04090019" w:tentative="1">
+      <w:start w:val="1"/>
+      <w:numFmt w:val="lowerLetter"/>
+      <w:lvlText w:val="%2."/>
+      <w:lvlJc w:val="left"/>
+      <w:pPr>
+        <w:ind w:left="4140" w:hanging="360"/>
+      </w:pPr>
+    </w:lvl>
+    <w:lvl w:ilvl="2" w:tplc="0409001B">
+      <w:start w:val="1"/>
+      <w:numFmt w:val="lowerRoman"/>
+      <w:lvlText w:val="%3."/>
+      <w:lvlJc w:val="right"/>
+      <w:pPr>
+        <w:ind w:left="4860" w:hanging="180"/>
+      </w:pPr>
+    </w:lvl>
+    <w:lvl w:ilvl="3" w:tplc="0409000F" w:tentative="1">
+      <w:start w:val="1"/>
+      <w:numFmt w:val="decimal"/>
+      <w:lvlText w:val="%4."/>
+      <w:lvlJc w:val="left"/>
+      <w:pPr>
+        <w:ind w:left="5580" w:hanging="360"/>
+      </w:pPr>
+    </w:lvl>
+    <w:lvl w:ilvl="4" w:tplc="04090019" w:tentative="1">
+      <w:start w:val="1"/>
+      <w:numFmt w:val="lowerLetter"/>
+      <w:lvlText w:val="%5."/>
+      <w:lvlJc w:val="left"/>
+      <w:pPr>
+        <w:ind w:left="6300" w:hanging="360"/>
+      </w:pPr>
+    </w:lvl>
+    <w:lvl w:ilvl="5" w:tplc="0409001B" w:tentative="1">
+      <w:start w:val="1"/>
+      <w:numFmt w:val="lowerRoman"/>
+      <w:lvlText w:val="%6."/>
+      <w:lvlJc w:val="right"/>
+      <w:pPr>
+        <w:ind w:left="7020" w:hanging="180"/>
+      </w:pPr>
+    </w:lvl>
+    <w:lvl w:ilvl="6" w:tplc="0409000F" w:tentative="1">
+      <w:start w:val="1"/>
+      <w:numFmt w:val="decimal"/>
+      <w:lvlText w:val="%7."/>
+      <w:lvlJc w:val="left"/>
+      <w:pPr>
+        <w:ind w:left="7740" w:hanging="360"/>
+      </w:pPr>
+    </w:lvl>
+    <w:lvl w:ilvl="7" w:tplc="04090019" w:tentative="1">
+      <w:start w:val="1"/>
+      <w:numFmt w:val="lowerLetter"/>
+      <w:lvlText w:val="%8."/>
+      <w:lvlJc w:val="left"/>
+      <w:pPr>
+        <w:ind w:left="8460" w:hanging="360"/>
+      </w:pPr>
+    </w:lvl>
+    <w:lvl w:ilvl="8" w:tplc="0409001B" w:tentative="1">
+      <w:start w:val="1"/>
+      <w:numFmt w:val="lowerRoman"/>
+      <w:lvlText w:val="%9."/>
+      <w:lvlJc w:val="right"/>
+      <w:pPr>
+        <w:ind w:left="9180" w:hanging="180"/>
+      </w:pPr>
+    </w:lvl>
+  </w:abstractNum>
+  <w:abstractNum w:abstractNumId="6" w15:restartNumberingAfterBreak="0">
+    <w:nsid w:val="41EE0BC1"/>
+    <w:multiLevelType w:val="hybridMultilevel"/>
+    <w:tmpl w:val="601EF8B0"/>
+    <w:lvl w:ilvl="0" w:tplc="7EA03332">
+      <w:start w:val="1"/>
+      <w:numFmt w:val="decimal"/>
+      <w:lvlText w:val="%1."/>
+      <w:lvlJc w:val="left"/>
+      <w:pPr>
+        <w:ind w:left="720" w:hanging="360"/>
+      </w:pPr>
+      <w:rPr>
+        <w:b w:val="0"/>
+        <w:bCs w:val="0"/>
+        <w:color w:val="auto"/>
+      </w:rPr>
+    </w:lvl>
     <w:lvl w:ilvl="1" w:tplc="20081666">
       <w:start w:val="1"/>
       <w:numFmt w:val="lowerLetter"/>
@@ -2965,7 +3527,7 @@
       </w:pPr>
     </w:lvl>
   </w:abstractNum>
-  <w:abstractNum w:abstractNumId="6" w15:restartNumberingAfterBreak="0">
+  <w:abstractNum w:abstractNumId="7" w15:restartNumberingAfterBreak="0">
     <w:nsid w:val="509357A9"/>
     <w:multiLevelType w:val="hybridMultilevel"/>
     <w:tmpl w:val="4886B714"/>
@@ -3069,7 +3631,7 @@
       </w:pPr>
     </w:lvl>
   </w:abstractNum>
-  <w:abstractNum w:abstractNumId="7" w15:restartNumberingAfterBreak="0">
+  <w:abstractNum w:abstractNumId="8" w15:restartNumberingAfterBreak="0">
     <w:nsid w:val="535F3C02"/>
     <w:multiLevelType w:val="hybridMultilevel"/>
     <w:tmpl w:val="B6D2432C"/>
@@ -3160,7 +3722,7 @@
       </w:pPr>
     </w:lvl>
   </w:abstractNum>
-  <w:abstractNum w:abstractNumId="8" w15:restartNumberingAfterBreak="0">
+  <w:abstractNum w:abstractNumId="9" w15:restartNumberingAfterBreak="0">
     <w:nsid w:val="58502E93"/>
     <w:multiLevelType w:val="hybridMultilevel"/>
     <w:tmpl w:val="11DA3DE6"/>
@@ -3249,7 +3811,7 @@
       </w:pPr>
     </w:lvl>
   </w:abstractNum>
-  <w:abstractNum w:abstractNumId="9" w15:restartNumberingAfterBreak="0">
+  <w:abstractNum w:abstractNumId="10" w15:restartNumberingAfterBreak="0">
     <w:nsid w:val="589E011A"/>
     <w:multiLevelType w:val="hybridMultilevel"/>
     <w:tmpl w:val="E0722418"/>
@@ -3338,7 +3900,7 @@
       </w:pPr>
     </w:lvl>
   </w:abstractNum>
-  <w:abstractNum w:abstractNumId="10" w15:restartNumberingAfterBreak="0">
+  <w:abstractNum w:abstractNumId="11" w15:restartNumberingAfterBreak="0">
     <w:nsid w:val="64DA4E4A"/>
     <w:multiLevelType w:val="hybridMultilevel"/>
     <w:tmpl w:val="58CE5C72"/>
@@ -3427,7 +3989,7 @@
       </w:pPr>
     </w:lvl>
   </w:abstractNum>
-  <w:abstractNum w:abstractNumId="11" w15:restartNumberingAfterBreak="0">
+  <w:abstractNum w:abstractNumId="12" w15:restartNumberingAfterBreak="0">
     <w:nsid w:val="74E65CA1"/>
     <w:multiLevelType w:val="multilevel"/>
     <w:tmpl w:val="AA7E10FA"/>
@@ -3541,25 +4103,25 @@
     </w:lvl>
   </w:abstractNum>
   <w:num w:numId="1" w16cid:durableId="1166821565">
-    <w:abstractNumId w:val="6"/>
+    <w:abstractNumId w:val="7"/>
   </w:num>
   <w:num w:numId="2" w16cid:durableId="1937014254">
-    <w:abstractNumId w:val="10"/>
+    <w:abstractNumId w:val="11"/>
   </w:num>
   <w:num w:numId="3" w16cid:durableId="1692761144">
-    <w:abstractNumId w:val="11"/>
+    <w:abstractNumId w:val="12"/>
   </w:num>
   <w:num w:numId="4" w16cid:durableId="1391227761">
     <w:abstractNumId w:val="3"/>
   </w:num>
   <w:num w:numId="5" w16cid:durableId="801311115">
-    <w:abstractNumId w:val="9"/>
+    <w:abstractNumId w:val="10"/>
   </w:num>
   <w:num w:numId="6" w16cid:durableId="889808313">
-    <w:abstractNumId w:val="5"/>
+    <w:abstractNumId w:val="6"/>
   </w:num>
   <w:num w:numId="7" w16cid:durableId="285356570">
-    <w:abstractNumId w:val="7"/>
+    <w:abstractNumId w:val="8"/>
   </w:num>
   <w:num w:numId="8" w16cid:durableId="1520116835">
     <w:abstractNumId w:val="2"/>
@@ -3571,10 +4133,13 @@
     <w:abstractNumId w:val="1"/>
   </w:num>
   <w:num w:numId="11" w16cid:durableId="982320569">
-    <w:abstractNumId w:val="4"/>
+    <w:abstractNumId w:val="5"/>
   </w:num>
   <w:num w:numId="12" w16cid:durableId="371925112">
-    <w:abstractNumId w:val="8"/>
+    <w:abstractNumId w:val="9"/>
+  </w:num>
+  <w:num w:numId="13" w16cid:durableId="2013877148">
+    <w:abstractNumId w:val="4"/>
   </w:num>
 </w:numbering>
 </file>
@@ -4188,6 +4753,7 @@
   <w:style w:type="character" w:default="1" w:styleId="DefaultParagraphFont">
     <w:name w:val="Default Paragraph Font"/>
     <w:uiPriority w:val="1"/>
+    <w:semiHidden/>
     <w:unhideWhenUsed/>
   </w:style>
   <w:style w:type="table" w:default="1" w:styleId="TableNormal">
@@ -4692,6 +5258,16 @@
       <w14:ligatures w14:val="none"/>
     </w:rPr>
   </w:style>
+  <w:style w:type="numbering" w:customStyle="1" w:styleId="CurrentList1">
+    <w:name w:val="Current List1"/>
+    <w:uiPriority w:val="99"/>
+    <w:rsid w:val="00EE1438"/>
+    <w:pPr>
+      <w:numPr>
+        <w:numId w:val="13"/>
+      </w:numPr>
+    </w:pPr>
+  </w:style>
 </w:styles>
 </file>
 

</xml_diff>